<commit_message>
Arm drop tracker with warning alarm
</commit_message>
<xml_diff>
--- a/documentation/Lifeline_Two_Minute_Code_Presentation.docx
+++ b/documentation/Lifeline_Two_Minute_Code_Presentation.docx
@@ -47,7 +47,7 @@
         <w:spacing w:line="259" w:lineRule="auto"/>
       </w:pPr>
       <w:r>
-        <w:t>The tracker reads DeviceMotion data only after the user turns it on. In app.js, IMPACT_MS2 is set to 25, so a hard movement calls startDropAlarm. That function plays click.mp3 on a loop, displays a ten-second countdown, and keeps a large Stop button on screen. stopDropAlarm always pauses and rewinds the audio before showing the next choice.</w:t>
+        <w:t>The user presses Start tracker, then app.js waits five seconds before it reads DeviceMotion data. This gives the person time to put the phone down. IMPACT_MS2 is set to 25, so a hard movement calls startDropAlarm. That function loops warning-alarm.mp3, displays a ten-second countdown, and keeps a large Stop button on screen.</w:t>
       </w:r>
     </w:p>
     <w:p>
@@ -79,7 +79,7 @@
         <w:spacing w:line="259" w:lineRule="auto"/>
       </w:pPr>
       <w:r>
-        <w:t>fall-detection.html supplies the sensor switch, alarm overlay, audio element, and map dialog. app.js owns the sensor, timer, Stop, and geolocation behavior. nav.js makes the Drop tracker link visible on every page, while site.css keeps the interface plain, readable, responsive, and keyboard-friendly. sound.js handles ordinary interface feedback separately from the ten-second alarm, and auth.js keeps the prototype login and sign-up controls honest by sending and saving nothing.</w:t>
+        <w:t>fall-detection.html supplies the Start tracker control, alarm overlay, audio element, and map dialog. app.js owns the five-second arming delay, sensor, alarm timer, Stop action, and geolocation behavior. nav.js makes the Drop tracker link visible on every page, while site.css keeps the interface plain and readable. sound.js handles ordinary clicks separately from the warning-alarm MP3.</w:t>
       </w:r>
     </w:p>
     <w:p>
@@ -285,7 +285,7 @@
                 <w:rFonts w:ascii="Consolas" w:hAnsi="Consolas"/>
                 <w:sz w:val="17"/>
               </w:rPr>
-              <w:t>if (key === "impact") startDropAlarm();</w:t>
+              <w:t>const ARM_DELAY_S = 5;</w:t>
             </w:r>
           </w:p>
         </w:tc>
@@ -308,7 +308,7 @@
               <w:rPr>
                 <w:sz w:val="17"/>
               </w:rPr>
-              <w:t>Starts the alarm when the impact signal fires.</w:t>
+              <w:t>Waits five seconds before motion monitoring begins.</w:t>
             </w:r>
           </w:p>
         </w:tc>
@@ -355,7 +355,7 @@
                 <w:rFonts w:ascii="Consolas" w:hAnsi="Consolas"/>
                 <w:sz w:val="17"/>
               </w:rPr>
-              <w:t>audio.pause(); audio.currentTime = 0;</w:t>
+              <w:t>if (key === "impact") startDropAlarm();</w:t>
             </w:r>
           </w:p>
         </w:tc>
@@ -377,7 +377,7 @@
               <w:rPr>
                 <w:sz w:val="17"/>
               </w:rPr>
-              <w:t>Stops and resets the MP3 immediately.</w:t>
+              <w:t>Starts the alarm when the impact signal fires.</w:t>
             </w:r>
           </w:p>
         </w:tc>
@@ -426,6 +426,76 @@
                 <w:rFonts w:ascii="Consolas" w:hAnsi="Consolas"/>
                 <w:sz w:val="17"/>
               </w:rPr>
+              <w:t>audio.pause(); audio.currentTime = 0;</w:t>
+            </w:r>
+          </w:p>
+        </w:tc>
+        <w:tc>
+          <w:tcPr>
+            <w:tcW w:type="dxa" w:w="3816"/>
+            <w:vAlign w:val="center"/>
+            <w:shd w:fill="F3F4F6"/>
+            <w:tcBorders>
+              <w:top w:val="single" w:sz="4" w:color="D9D9D9"/>
+              <w:left w:val="single" w:sz="4" w:color="D9D9D9"/>
+              <w:bottom w:val="single" w:sz="4" w:color="D9D9D9"/>
+              <w:right w:val="single" w:sz="4" w:color="D9D9D9"/>
+              <w:insideH w:val="single" w:sz="4" w:color="D9D9D9"/>
+              <w:insideV w:val="single" w:sz="4" w:color="D9D9D9"/>
+            </w:tcBorders>
+          </w:tcPr>
+          <w:p>
+            <w:r>
+              <w:rPr>
+                <w:sz w:val="17"/>
+              </w:rPr>
+              <w:t>Stops and resets the MP3 immediately.</w:t>
+            </w:r>
+          </w:p>
+        </w:tc>
+      </w:tr>
+      <w:tr>
+        <w:tc>
+          <w:tcPr>
+            <w:tcW w:type="dxa" w:w="1512"/>
+            <w:vAlign w:val="center"/>
+            <w:tcBorders>
+              <w:top w:val="single" w:sz="4" w:color="D9D9D9"/>
+              <w:left w:val="single" w:sz="4" w:color="D9D9D9"/>
+              <w:bottom w:val="single" w:sz="4" w:color="D9D9D9"/>
+              <w:right w:val="single" w:sz="4" w:color="D9D9D9"/>
+              <w:insideH w:val="single" w:sz="4" w:color="D9D9D9"/>
+              <w:insideV w:val="single" w:sz="4" w:color="D9D9D9"/>
+            </w:tcBorders>
+          </w:tcPr>
+          <w:p>
+            <w:r>
+              <w:rPr>
+                <w:sz w:val="17"/>
+              </w:rPr>
+              <w:t>app.js</w:t>
+            </w:r>
+          </w:p>
+        </w:tc>
+        <w:tc>
+          <w:tcPr>
+            <w:tcW w:type="dxa" w:w="4536"/>
+            <w:vAlign w:val="center"/>
+            <w:tcBorders>
+              <w:top w:val="single" w:sz="4" w:color="D9D9D9"/>
+              <w:left w:val="single" w:sz="4" w:color="D9D9D9"/>
+              <w:bottom w:val="single" w:sz="4" w:color="D9D9D9"/>
+              <w:right w:val="single" w:sz="4" w:color="D9D9D9"/>
+              <w:insideH w:val="single" w:sz="4" w:color="D9D9D9"/>
+              <w:insideV w:val="single" w:sz="4" w:color="D9D9D9"/>
+            </w:tcBorders>
+          </w:tcPr>
+          <w:p>
+            <w:r>
+              <w:rPr>
+                <w:rFonts w:ascii="Consolas" w:hAnsi="Consolas"/>
+                <w:sz w:val="17"/>
+              </w:rPr>
               <w:t>navigator.geolocation.getCurrentPosition(...)</w:t>
             </w:r>
           </w:p>
@@ -434,7 +504,6 @@
           <w:tcPr>
             <w:tcW w:type="dxa" w:w="3816"/>
             <w:vAlign w:val="center"/>
-            <w:shd w:fill="F3F4F6"/>
             <w:tcBorders>
               <w:top w:val="single" w:sz="4" w:color="D9D9D9"/>
               <w:left w:val="single" w:sz="4" w:color="D9D9D9"/>
@@ -459,6 +528,7 @@
           <w:tcPr>
             <w:tcW w:type="dxa" w:w="1512"/>
             <w:vAlign w:val="center"/>
+            <w:shd w:fill="F3F4F6"/>
             <w:tcBorders>
               <w:top w:val="single" w:sz="4" w:color="D9D9D9"/>
               <w:left w:val="single" w:sz="4" w:color="D9D9D9"/>
@@ -474,76 +544,6 @@
                 <w:sz w:val="17"/>
               </w:rPr>
               <w:t>fall-detection.html</w:t>
-            </w:r>
-          </w:p>
-        </w:tc>
-        <w:tc>
-          <w:tcPr>
-            <w:tcW w:type="dxa" w:w="4536"/>
-            <w:vAlign w:val="center"/>
-            <w:tcBorders>
-              <w:top w:val="single" w:sz="4" w:color="D9D9D9"/>
-              <w:left w:val="single" w:sz="4" w:color="D9D9D9"/>
-              <w:bottom w:val="single" w:sz="4" w:color="D9D9D9"/>
-              <w:right w:val="single" w:sz="4" w:color="D9D9D9"/>
-              <w:insideH w:val="single" w:sz="4" w:color="D9D9D9"/>
-              <w:insideV w:val="single" w:sz="4" w:color="D9D9D9"/>
-            </w:tcBorders>
-          </w:tcPr>
-          <w:p>
-            <w:r>
-              <w:rPr>
-                <w:rFonts w:ascii="Consolas" w:hAnsi="Consolas"/>
-                <w:sz w:val="17"/>
-              </w:rPr>
-              <w:t>&lt;audio id="alarmSound" src="click.mp3" loop&gt;</w:t>
-            </w:r>
-          </w:p>
-        </w:tc>
-        <w:tc>
-          <w:tcPr>
-            <w:tcW w:type="dxa" w:w="3816"/>
-            <w:vAlign w:val="center"/>
-            <w:tcBorders>
-              <w:top w:val="single" w:sz="4" w:color="D9D9D9"/>
-              <w:left w:val="single" w:sz="4" w:color="D9D9D9"/>
-              <w:bottom w:val="single" w:sz="4" w:color="D9D9D9"/>
-              <w:right w:val="single" w:sz="4" w:color="D9D9D9"/>
-              <w:insideH w:val="single" w:sz="4" w:color="D9D9D9"/>
-              <w:insideV w:val="single" w:sz="4" w:color="D9D9D9"/>
-            </w:tcBorders>
-          </w:tcPr>
-          <w:p>
-            <w:r>
-              <w:rPr>
-                <w:sz w:val="17"/>
-              </w:rPr>
-              <w:t>Connects the supplied MP3 to the alarm.</w:t>
-            </w:r>
-          </w:p>
-        </w:tc>
-      </w:tr>
-      <w:tr>
-        <w:tc>
-          <w:tcPr>
-            <w:tcW w:type="dxa" w:w="1512"/>
-            <w:vAlign w:val="center"/>
-            <w:shd w:fill="F3F4F6"/>
-            <w:tcBorders>
-              <w:top w:val="single" w:sz="4" w:color="D9D9D9"/>
-              <w:left w:val="single" w:sz="4" w:color="D9D9D9"/>
-              <w:bottom w:val="single" w:sz="4" w:color="D9D9D9"/>
-              <w:right w:val="single" w:sz="4" w:color="D9D9D9"/>
-              <w:insideH w:val="single" w:sz="4" w:color="D9D9D9"/>
-              <w:insideV w:val="single" w:sz="4" w:color="D9D9D9"/>
-            </w:tcBorders>
-          </w:tcPr>
-          <w:p>
-            <w:r>
-              <w:rPr>
-                <w:sz w:val="17"/>
-              </w:rPr>
-              <w:t>nav.js</w:t>
             </w:r>
           </w:p>
         </w:tc>
@@ -567,6 +567,76 @@
                 <w:rFonts w:ascii="Consolas" w:hAnsi="Consolas"/>
                 <w:sz w:val="17"/>
               </w:rPr>
+              <w:t>&lt;audio id="alarmSound" src="warning-alarm.mp3" loop&gt;</w:t>
+            </w:r>
+          </w:p>
+        </w:tc>
+        <w:tc>
+          <w:tcPr>
+            <w:tcW w:type="dxa" w:w="3816"/>
+            <w:vAlign w:val="center"/>
+            <w:shd w:fill="F3F4F6"/>
+            <w:tcBorders>
+              <w:top w:val="single" w:sz="4" w:color="D9D9D9"/>
+              <w:left w:val="single" w:sz="4" w:color="D9D9D9"/>
+              <w:bottom w:val="single" w:sz="4" w:color="D9D9D9"/>
+              <w:right w:val="single" w:sz="4" w:color="D9D9D9"/>
+              <w:insideH w:val="single" w:sz="4" w:color="D9D9D9"/>
+              <w:insideV w:val="single" w:sz="4" w:color="D9D9D9"/>
+            </w:tcBorders>
+          </w:tcPr>
+          <w:p>
+            <w:r>
+              <w:rPr>
+                <w:sz w:val="17"/>
+              </w:rPr>
+              <w:t>Connects the supplied warning MP3 to the alarm.</w:t>
+            </w:r>
+          </w:p>
+        </w:tc>
+      </w:tr>
+      <w:tr>
+        <w:tc>
+          <w:tcPr>
+            <w:tcW w:type="dxa" w:w="1512"/>
+            <w:vAlign w:val="center"/>
+            <w:tcBorders>
+              <w:top w:val="single" w:sz="4" w:color="D9D9D9"/>
+              <w:left w:val="single" w:sz="4" w:color="D9D9D9"/>
+              <w:bottom w:val="single" w:sz="4" w:color="D9D9D9"/>
+              <w:right w:val="single" w:sz="4" w:color="D9D9D9"/>
+              <w:insideH w:val="single" w:sz="4" w:color="D9D9D9"/>
+              <w:insideV w:val="single" w:sz="4" w:color="D9D9D9"/>
+            </w:tcBorders>
+          </w:tcPr>
+          <w:p>
+            <w:r>
+              <w:rPr>
+                <w:sz w:val="17"/>
+              </w:rPr>
+              <w:t>nav.js</w:t>
+            </w:r>
+          </w:p>
+        </w:tc>
+        <w:tc>
+          <w:tcPr>
+            <w:tcW w:type="dxa" w:w="4536"/>
+            <w:vAlign w:val="center"/>
+            <w:tcBorders>
+              <w:top w:val="single" w:sz="4" w:color="D9D9D9"/>
+              <w:left w:val="single" w:sz="4" w:color="D9D9D9"/>
+              <w:bottom w:val="single" w:sz="4" w:color="D9D9D9"/>
+              <w:right w:val="single" w:sz="4" w:color="D9D9D9"/>
+              <w:insideH w:val="single" w:sz="4" w:color="D9D9D9"/>
+              <w:insideV w:val="single" w:sz="4" w:color="D9D9D9"/>
+            </w:tcBorders>
+          </w:tcPr>
+          <w:p>
+            <w:r>
+              <w:rPr>
+                <w:rFonts w:ascii="Consolas" w:hAnsi="Consolas"/>
+                <w:sz w:val="17"/>
+              </w:rPr>
               <w:t>label: "Drop tracker"</w:t>
             </w:r>
           </w:p>
@@ -575,7 +645,6 @@
           <w:tcPr>
             <w:tcW w:type="dxa" w:w="3816"/>
             <w:vAlign w:val="center"/>
-            <w:shd w:fill="F3F4F6"/>
             <w:tcBorders>
               <w:top w:val="single" w:sz="4" w:color="D9D9D9"/>
               <w:left w:val="single" w:sz="4" w:color="D9D9D9"/>

</xml_diff>